<commit_message>
feat: modernize CV with markdown source, build CLI, and updated experience
</commit_message>
<xml_diff>
--- a/cv.docx
+++ b/cv.docx
@@ -27,7 +27,7 @@
           <w:color w:val="0969DA"/>
           <w:sz w:val="23"/>
         </w:rPr>
-        <w:t>Senior / Lead Software Engineer &amp; Systems Architect</w:t>
+        <w:t>Senior Full-Stack &amp; Systems Engineer</w:t>
       </w:r>
     </w:p>
     <w:p>
@@ -40,7 +40,7 @@
           <w:color w:val="555555"/>
           <w:sz w:val="18"/>
         </w:rPr>
-        <w:t>Aberdeen, UK • charles63500@gmail.com • +44 7397 174345</w:t>
+        <w:t>Edinburgh, UK • charles63500@gmail.com • +44 7397 174345</w:t>
       </w:r>
     </w:p>
     <w:p>
@@ -80,7 +80,7 @@
         <w:rPr>
           <w:sz w:val="19"/>
         </w:rPr>
-        <w:t>Versatile, hands-on Lead Software Engineer and Systems Architect with 10+ years of experience engineering high-performance distributed platforms, discrete-event simulation &amp; logistics optimization engines, and full-stack cloud-native web applications. Proven track record leading architecture and end-to-end delivery: from database tuning, GIS/routing algorithms, and real-time streaming to modern web UIs (React 19, TypeScript, Vite), Go/Bun microservices, Docker/Kubernetes infrastructure, CI/CD automation, and AI-accelerated workflows.</w:t>
+        <w:t>Versatile, hands-on Senior Full-Stack &amp; Systems Engineer with 10+ years of experience engineering high-performance distributed platforms, discrete-event simulation &amp; logistics optimization engines, and full-stack cloud-native web applications. Proven track record leading architecture and end-to-end delivery: from database tuning, GIS/routing algorithms, and real-time streaming to modern web UIs (React 19, TypeScript, Vite), Go/Bun microservices, Docker/Kubernetes infrastructure, CI/CD automation, and AI-accelerated workflows.</w:t>
       </w:r>
     </w:p>
     <w:p>
@@ -265,20 +265,18 @@
           <w:color w:val="0F172A"/>
           <w:sz w:val="21"/>
         </w:rPr>
-        <w:t>Lead Software Engineer &amp; Systems Architect</w:t>
+        <w:t>Senior Software Engineer</w:t>
       </w:r>
     </w:p>
     <w:p>
       <w:pPr>
-        <w:spacing w:before="0" w:after="80"/>
-        <w:jc w:val="center"/>
+        <w:spacing w:before="40" w:after="80"/>
       </w:pPr>
       <w:r>
         <w:rPr>
-          <w:color w:val="555555"/>
-          <w:sz w:val="18"/>
+          <w:sz w:val="19"/>
         </w:rPr>
-        <w:t>*Celerum Ltd &amp; PlanSea Solutions* — Aberdeen, UK</w:t>
+        <w:t>Celerum Ltd — Aberdeen, UK</w:t>
       </w:r>
     </w:p>
     <w:p>
@@ -311,7 +309,7 @@
         <w:rPr>
           <w:sz w:val="19"/>
         </w:rPr>
-        <w:t xml:space="preserve"> Architected and engineered PlanSea v2 (cloud-native marine logistics and offshore supply vessel planning platform) unifying legacy monorepos into a modern Bun, Hono, React 19, and TypeScript web platform with Python/SimPy simulation and C# optimization engines as specialized background workers.</w:t>
+        <w:t xml:space="preserve"> Architected and engineered an enterprise cloud-native marine logistics and offshore supply vessel planning platform, unifying fragmented services into a modern Bun, Hono, React 19, and TypeScript web platform with Python/SimPy simulation and C# optimization engines as specialized background workers.</w:t>
       </w:r>
     </w:p>
     <w:p>
@@ -449,15 +447,13 @@
     </w:p>
     <w:p>
       <w:pPr>
-        <w:spacing w:before="0" w:after="80"/>
-        <w:jc w:val="center"/>
+        <w:spacing w:before="40" w:after="80"/>
       </w:pPr>
       <w:r>
         <w:rPr>
-          <w:color w:val="555555"/>
-          <w:sz w:val="18"/>
+          <w:sz w:val="19"/>
         </w:rPr>
-        <w:t>*Robert Gordon University &amp; ARR Craib* — Aberdeen, UK</w:t>
+        <w:t>Robert Gordon University &amp; ARR Craib — Aberdeen, UK</w:t>
       </w:r>
     </w:p>
     <w:p>

</xml_diff>